<commit_message>
Monthly Signal (Aug): add Nick's editor's read before publish
The sanctioned hand-edit to the frozen Signal: the human read of the month
in italics, placeholder prompt removed. docx remade to match.

Co-Authored-By: Claude Opus 4.8 <noreply@anthropic.com>
</commit_message>
<xml_diff>
--- a/reports/signals/docx/levanter-signal-monthly-2026-08.docx
+++ b/reports/signals/docx/levanter-signal-monthly-2026-08.docx
@@ -63,12 +63,9 @@
       </w:pPr>
       <w:r>
         <w:rPr>
-          <w:b/>
+          <w:i/>
         </w:rPr>
-        <w:t>Editor's line (add before publishing, then delete this prompt):</w:t>
-      </w:r>
-      <w:r>
-        <w:t xml:space="preserve"> one sentence of your own read of the month. What it changes about how you are positioned, or the single thing you would tell a friend who asked. This is the line the model cannot write.</w:t>
+        <w:t>A strong month does not undo a hard year. Crypto is up a fifth since July and still down about half over twelve months, so I am reading this as room to stay patient rather than a reason to chase. Metals and the largest coins bid together while the dollar stayed quiet, which looks to me like liquidity hunting for a home rather than conviction about anything in particular, and liquidity can leave as fast as it arrives. The number I would sit with is not the plus twenty in crypto but the coin-flip direction record beside it, so enjoy the green, size for the drawdowns, and do not mistake a good month for a good year.</w:t>
       </w:r>
     </w:p>
     <w:p>

</xml_diff>

<commit_message>
Monthly Signal: mark where the valuation chart goes
The monthly note described the bitcoin valuation fit but never marked a
position for btc_metcalfe.png, so the chart had no home at publish time.
Emit the same callout the weekly Signal uses, placed between the
valuation-fit paragraph and the cycle-gauge one, since the chart plots
the first fit and not the second.

Also applied to the August note and its docx by hand rather than by
re-running the generator, which would have overwritten the August
month-end snapshot with today's prices and moved the published figures.

Co-Authored-By: Claude Opus 5 (1M context) <noreply@anthropic.com>
</commit_message>
<xml_diff>
--- a/reports/signals/docx/levanter-signal-monthly-2026-08.docx
+++ b/reports/signals/docx/levanter-signal-monthly-2026-08.docx
@@ -400,6 +400,14 @@
       </w:r>
       <w:r>
         <w:t xml:space="preserve"> models price against how long the network has existed, on a log-log scale. Fair value on that fit lands near 135,000, with bitcoin about 43 percent below it, and the fitted floor sits near 59,000. Bitcoin has closed above that floor for roughly 95 percent of the historical sample. That is an in-sample observation, not a tested probability and not a guaranteed level of support.</w:t>
+      </w:r>
+    </w:p>
+    <w:p>
+      <w:r>
+        <w:rPr>
+          <w:i/>
+        </w:rPr>
+        <w:t>(Chart: bitcoin price against its fitted fair value and floor.)</w:t>
       </w:r>
     </w:p>
     <w:p>

</xml_diff>